<commit_message>
feat(pre-build): implement the script-guide sync and revision-header gates as blocking invariants 61 and 62, retiring both registered gate-debt deferrals
Invariant 61 requires every scripts/**/*.sh to have docs/scripts/<name>.md that is not older than the script (uncommitted edits count as now). Brownfield adoption is a monotone-decreasing ratchet: baseline seeded with 63 rows (52 missing guides, 11 guides behind their script); new findings and retired rows both fail. Invariant 62 requires Revision and a UTC Last modified in every docs/scripts guide; 1 of 45 failed and was corrected, so it is a hard floor. The gate-debt register test now accepts a named gate as implemented or deferred, never absent. Both gates pin LC_ALL=C after a live sort/comm collation mismatch was caught by a new regression arm.

Co-Authored-By: Claude Opus 5.5 <noreply@anthropic.com> [skip-ci]
</commit_message>
<xml_diff>
--- a/docs/scripts/tunnel-keepalive.docx
+++ b/docs/scripts/tunnel-keepalive.docx
@@ -26,7 +26,7 @@
         <w:t xml:space="preserve"> </w:t>
       </w:r>
       <w:r>
-        <w:t xml:space="preserve">1</w:t>
+        <w:t xml:space="preserve">2</w:t>
       </w:r>
       <w:r>
         <w:t xml:space="preserve"> </w:t>
@@ -42,7 +42,7 @@
         <w:t xml:space="preserve"> </w:t>
       </w:r>
       <w:r>
-        <w:t xml:space="preserve">2026-06-14T16:40:00+0300</w:t>
+        <w:t xml:space="preserve">2026-09-26T13:50:00Z</w:t>
       </w:r>
     </w:p>
     <w:bookmarkStart w:id="9" w:name="overview"/>

</xml_diff>